<commit_message>
docs: atualizacao de documentos
</commit_message>
<xml_diff>
--- a/ApêndiceB-Requisitos/PID_RequisitosFuncionais.docx
+++ b/ApêndiceB-Requisitos/PID_RequisitosFuncionais.docx
@@ -572,45 +572,58 @@
       </w:r>
     </w:p>
     <w:p>
-      <w:r>
-        <w:rPr>
-          <w:rStyle w:val="bzpyqfadein"/>
+      <w:pPr>
+        <w:spacing w:before="240" w:after="240" w:line="360" w:lineRule="auto"/>
+        <w:jc w:val="both"/>
+        <w:rPr>
+          <w:rFonts w:ascii="Times New Roman" w:hAnsi="Times New Roman" w:cs="Times New Roman"/>
+          <w:sz w:val="24"/>
+          <w:szCs w:val="24"/>
+        </w:rPr>
+      </w:pPr>
+      <w:r>
+        <w:rPr>
+          <w:rFonts w:ascii="Times New Roman" w:hAnsi="Times New Roman" w:cs="Times New Roman"/>
+          <w:sz w:val="24"/>
+          <w:szCs w:val="24"/>
         </w:rPr>
         <w:t xml:space="preserve">Descrição: O sistema deve permitir que usuários cadastrados </w:t>
       </w:r>
       <w:proofErr w:type="gramStart"/>
       <w:r>
         <w:rPr>
-          <w:rStyle w:val="bzpyqfadein"/>
+          <w:rFonts w:ascii="Times New Roman" w:hAnsi="Times New Roman" w:cs="Times New Roman"/>
+          <w:sz w:val="24"/>
+          <w:szCs w:val="24"/>
         </w:rPr>
         <w:t>realizem</w:t>
       </w:r>
       <w:proofErr w:type="gramEnd"/>
       <w:r>
         <w:rPr>
-          <w:rStyle w:val="bzpyqfadein"/>
+          <w:rFonts w:ascii="Times New Roman" w:hAnsi="Times New Roman" w:cs="Times New Roman"/>
+          <w:sz w:val="24"/>
+          <w:szCs w:val="24"/>
         </w:rPr>
         <w:t xml:space="preserve"> </w:t>
       </w:r>
       <w:proofErr w:type="spellStart"/>
       <w:r>
         <w:rPr>
-          <w:rStyle w:val="bzpyqfadein"/>
+          <w:rFonts w:ascii="Times New Roman" w:hAnsi="Times New Roman" w:cs="Times New Roman"/>
+          <w:sz w:val="24"/>
+          <w:szCs w:val="24"/>
         </w:rPr>
         <w:t>login</w:t>
       </w:r>
       <w:proofErr w:type="spellEnd"/>
       <w:r>
         <w:rPr>
-          <w:rStyle w:val="bzpyqfadein"/>
-        </w:rPr>
-        <w:t xml:space="preserve"> utilizando e-mail e senha par</w:t>
-      </w:r>
-      <w:r>
-        <w:rPr>
-          <w:rStyle w:val="bzpyqfadein"/>
-        </w:rPr>
-        <w:t>a acessar suas funcionalidades.</w:t>
+          <w:rFonts w:ascii="Times New Roman" w:hAnsi="Times New Roman" w:cs="Times New Roman"/>
+          <w:sz w:val="24"/>
+          <w:szCs w:val="24"/>
+        </w:rPr>
+        <w:t xml:space="preserve"> utilizando e-mail e senha para acessar suas funcionalidades.</w:t>
       </w:r>
     </w:p>
     <w:p>
@@ -659,6 +672,8 @@
     </w:p>
     <w:p>
       <w:pPr>
+        <w:spacing w:before="240" w:after="240" w:line="360" w:lineRule="auto"/>
+        <w:jc w:val="both"/>
         <w:rPr>
           <w:rFonts w:ascii="Times New Roman" w:hAnsi="Times New Roman" w:cs="Times New Roman"/>
           <w:sz w:val="24"/>
@@ -683,7 +698,6 @@
       </w:r>
       <w:r>
         <w:rPr>
-          <w:rStyle w:val="bzpyqfadein"/>
           <w:rFonts w:ascii="Times New Roman" w:hAnsi="Times New Roman" w:cs="Times New Roman"/>
           <w:sz w:val="24"/>
           <w:szCs w:val="24"/>
@@ -692,60 +706,437 @@
       </w:r>
     </w:p>
     <w:p>
-      <w:r>
-        <w:rPr>
-          <w:rStyle w:val="bzpyqfadein"/>
+      <w:pPr>
+        <w:spacing w:before="240" w:after="240" w:line="360" w:lineRule="auto"/>
+        <w:jc w:val="both"/>
+        <w:rPr>
+          <w:rFonts w:ascii="Times New Roman" w:hAnsi="Times New Roman" w:cs="Times New Roman"/>
+          <w:sz w:val="24"/>
+          <w:szCs w:val="24"/>
+        </w:rPr>
+      </w:pPr>
+      <w:r>
+        <w:rPr>
+          <w:rFonts w:ascii="Times New Roman" w:hAnsi="Times New Roman" w:cs="Times New Roman"/>
+          <w:sz w:val="24"/>
+          <w:szCs w:val="24"/>
+        </w:rPr>
+        <w:t xml:space="preserve">Descrição: O sistema deve permitir que cuidadores </w:t>
+      </w:r>
+      <w:proofErr w:type="gramStart"/>
+      <w:r>
+        <w:rPr>
+          <w:rFonts w:ascii="Times New Roman" w:hAnsi="Times New Roman" w:cs="Times New Roman"/>
+          <w:sz w:val="24"/>
+          <w:szCs w:val="24"/>
+        </w:rPr>
+        <w:t>criem</w:t>
+      </w:r>
+      <w:proofErr w:type="gramEnd"/>
+      <w:r>
+        <w:rPr>
+          <w:rFonts w:ascii="Times New Roman" w:hAnsi="Times New Roman" w:cs="Times New Roman"/>
+          <w:sz w:val="24"/>
+          <w:szCs w:val="24"/>
+        </w:rPr>
+        <w:t xml:space="preserve"> um perfil profissional contendo informações como experiência, especializações, disponibilidade de horário e localização.</w:t>
+      </w:r>
+    </w:p>
+    <w:p>
+      <w:pPr>
+        <w:spacing w:before="240" w:after="240" w:line="360" w:lineRule="auto"/>
+        <w:jc w:val="both"/>
+        <w:rPr>
+          <w:rFonts w:ascii="Times New Roman" w:hAnsi="Times New Roman" w:cs="Times New Roman"/>
+          <w:sz w:val="24"/>
+          <w:szCs w:val="24"/>
+        </w:rPr>
+      </w:pPr>
+      <w:r>
+        <w:rPr>
+          <w:rFonts w:ascii="Times New Roman" w:hAnsi="Times New Roman" w:cs="Times New Roman"/>
+          <w:sz w:val="24"/>
+          <w:szCs w:val="24"/>
+        </w:rPr>
+        <w:t xml:space="preserve">Prioridade: (X) essencial </w:t>
+      </w:r>
+      <w:proofErr w:type="gramStart"/>
+      <w:r>
+        <w:rPr>
+          <w:rFonts w:ascii="Times New Roman" w:hAnsi="Times New Roman" w:cs="Times New Roman"/>
+          <w:sz w:val="24"/>
+          <w:szCs w:val="24"/>
+        </w:rPr>
+        <w:t xml:space="preserve">( </w:t>
+      </w:r>
+      <w:proofErr w:type="gramEnd"/>
+      <w:r>
+        <w:rPr>
+          <w:rFonts w:ascii="Times New Roman" w:hAnsi="Times New Roman" w:cs="Times New Roman"/>
+          <w:sz w:val="24"/>
+          <w:szCs w:val="24"/>
+        </w:rPr>
+        <w:t>) importante ( ) desejável</w:t>
+      </w:r>
+    </w:p>
+    <w:p>
+      <w:pPr>
+        <w:rPr>
+          <w:rFonts w:ascii="Times New Roman" w:hAnsi="Times New Roman" w:cs="Times New Roman"/>
+          <w:sz w:val="24"/>
+          <w:szCs w:val="24"/>
+        </w:rPr>
+      </w:pPr>
+    </w:p>
+    <w:p>
+      <w:pPr>
+        <w:spacing w:before="240" w:after="240" w:line="360" w:lineRule="auto"/>
+        <w:jc w:val="both"/>
+        <w:rPr>
+          <w:rFonts w:ascii="Times New Roman" w:hAnsi="Times New Roman" w:cs="Times New Roman"/>
+          <w:sz w:val="24"/>
+          <w:szCs w:val="24"/>
+        </w:rPr>
+      </w:pPr>
+      <w:r>
+        <w:rPr>
+          <w:rFonts w:ascii="Times New Roman" w:hAnsi="Times New Roman" w:cs="Times New Roman"/>
+          <w:sz w:val="24"/>
+          <w:szCs w:val="24"/>
+        </w:rPr>
+        <w:t xml:space="preserve">RF 4 – </w:t>
+      </w:r>
+      <w:r>
+        <w:rPr>
+          <w:rFonts w:ascii="Times New Roman" w:hAnsi="Times New Roman" w:cs="Times New Roman"/>
+          <w:sz w:val="24"/>
+          <w:szCs w:val="24"/>
+        </w:rPr>
+        <w:t>Buscar cuidadores</w:t>
+      </w:r>
+    </w:p>
+    <w:p>
+      <w:pPr>
+        <w:spacing w:before="240" w:after="240" w:line="360" w:lineRule="auto"/>
+        <w:jc w:val="both"/>
+        <w:rPr>
+          <w:rFonts w:ascii="Times New Roman" w:hAnsi="Times New Roman" w:cs="Times New Roman"/>
+          <w:sz w:val="24"/>
+          <w:szCs w:val="24"/>
+        </w:rPr>
+      </w:pPr>
+      <w:r>
+        <w:rPr>
+          <w:rFonts w:ascii="Times New Roman" w:hAnsi="Times New Roman" w:cs="Times New Roman"/>
+          <w:sz w:val="24"/>
+          <w:szCs w:val="24"/>
+        </w:rPr>
+        <w:t xml:space="preserve">Descrição: O sistema deve permitir que familiares </w:t>
+      </w:r>
+      <w:proofErr w:type="gramStart"/>
+      <w:r>
+        <w:rPr>
+          <w:rFonts w:ascii="Times New Roman" w:hAnsi="Times New Roman" w:cs="Times New Roman"/>
+          <w:sz w:val="24"/>
+          <w:szCs w:val="24"/>
+        </w:rPr>
+        <w:t>pesquisem</w:t>
+      </w:r>
+      <w:proofErr w:type="gramEnd"/>
+      <w:r>
+        <w:rPr>
+          <w:rFonts w:ascii="Times New Roman" w:hAnsi="Times New Roman" w:cs="Times New Roman"/>
+          <w:sz w:val="24"/>
+          <w:szCs w:val="24"/>
+        </w:rPr>
+        <w:t xml:space="preserve"> cuidadores disponíveis utilizando filtros, experiência e disponibilidade.</w:t>
+      </w:r>
+    </w:p>
+    <w:p>
+      <w:pPr>
+        <w:rPr>
+          <w:rFonts w:ascii="Times New Roman" w:hAnsi="Times New Roman" w:cs="Times New Roman"/>
+          <w:sz w:val="24"/>
+          <w:szCs w:val="24"/>
+        </w:rPr>
+      </w:pPr>
+    </w:p>
+    <w:p>
+      <w:pPr>
+        <w:rPr>
+          <w:rFonts w:ascii="Times New Roman" w:hAnsi="Times New Roman" w:cs="Times New Roman"/>
+          <w:sz w:val="24"/>
+          <w:szCs w:val="24"/>
+        </w:rPr>
+      </w:pPr>
+      <w:r>
+        <w:rPr>
+          <w:rFonts w:ascii="Times New Roman" w:hAnsi="Times New Roman" w:cs="Times New Roman"/>
+          <w:sz w:val="24"/>
+          <w:szCs w:val="24"/>
+        </w:rPr>
+        <w:t xml:space="preserve">Prioridade: (X) essencial </w:t>
+      </w:r>
+      <w:proofErr w:type="gramStart"/>
+      <w:r>
+        <w:rPr>
+          <w:rFonts w:ascii="Times New Roman" w:hAnsi="Times New Roman" w:cs="Times New Roman"/>
+          <w:sz w:val="24"/>
+          <w:szCs w:val="24"/>
+        </w:rPr>
+        <w:t xml:space="preserve">( </w:t>
+      </w:r>
+      <w:proofErr w:type="gramEnd"/>
+      <w:r>
+        <w:rPr>
+          <w:rFonts w:ascii="Times New Roman" w:hAnsi="Times New Roman" w:cs="Times New Roman"/>
+          <w:sz w:val="24"/>
+          <w:szCs w:val="24"/>
+        </w:rPr>
+        <w:t>) importante ( ) desejável</w:t>
+      </w:r>
+    </w:p>
+    <w:p>
+      <w:pPr>
+        <w:rPr>
+          <w:rFonts w:ascii="Times New Roman" w:hAnsi="Times New Roman" w:cs="Times New Roman"/>
+          <w:sz w:val="24"/>
+          <w:szCs w:val="24"/>
+        </w:rPr>
+      </w:pPr>
+    </w:p>
+    <w:p>
+      <w:pPr>
+        <w:rPr>
+          <w:rFonts w:ascii="Times New Roman" w:hAnsi="Times New Roman" w:cs="Times New Roman"/>
+          <w:sz w:val="24"/>
+          <w:szCs w:val="24"/>
+        </w:rPr>
+      </w:pPr>
+    </w:p>
+    <w:p>
+      <w:pPr>
+        <w:rPr>
+          <w:rFonts w:ascii="Times New Roman" w:hAnsi="Times New Roman" w:cs="Times New Roman"/>
+          <w:sz w:val="24"/>
+          <w:szCs w:val="24"/>
+        </w:rPr>
+      </w:pPr>
+    </w:p>
+    <w:p>
+      <w:pPr>
+        <w:rPr>
+          <w:rFonts w:ascii="Times New Roman" w:hAnsi="Times New Roman" w:cs="Times New Roman"/>
+          <w:sz w:val="24"/>
+          <w:szCs w:val="24"/>
+        </w:rPr>
+      </w:pPr>
+    </w:p>
+    <w:p>
+      <w:pPr>
+        <w:rPr>
+          <w:rFonts w:ascii="Times New Roman" w:hAnsi="Times New Roman" w:cs="Times New Roman"/>
+          <w:sz w:val="24"/>
+          <w:szCs w:val="24"/>
+        </w:rPr>
+      </w:pPr>
+      <w:r>
+        <w:rPr>
+          <w:rFonts w:ascii="Times New Roman" w:hAnsi="Times New Roman" w:cs="Times New Roman"/>
+          <w:sz w:val="24"/>
+          <w:szCs w:val="24"/>
+        </w:rPr>
+        <w:t xml:space="preserve">RF 5 </w:t>
+      </w:r>
+      <w:r>
+        <w:rPr>
+          <w:rFonts w:ascii="Times New Roman" w:hAnsi="Times New Roman" w:cs="Times New Roman"/>
+          <w:sz w:val="24"/>
+          <w:szCs w:val="24"/>
+        </w:rPr>
+        <w:t>– Visualizar perfil do cuidador</w:t>
+      </w:r>
+    </w:p>
+    <w:p>
+      <w:pPr>
+        <w:rPr>
+          <w:rFonts w:ascii="Times New Roman" w:hAnsi="Times New Roman" w:cs="Times New Roman"/>
+          <w:sz w:val="24"/>
+          <w:szCs w:val="24"/>
+        </w:rPr>
+      </w:pPr>
+      <w:r>
+        <w:rPr>
+          <w:rFonts w:ascii="Times New Roman" w:hAnsi="Times New Roman" w:cs="Times New Roman"/>
+          <w:sz w:val="24"/>
+          <w:szCs w:val="24"/>
+        </w:rPr>
+        <w:t xml:space="preserve">Descrição: O sistema deve permitir que usuários </w:t>
+      </w:r>
+      <w:proofErr w:type="gramStart"/>
+      <w:r>
+        <w:rPr>
+          <w:rFonts w:ascii="Times New Roman" w:hAnsi="Times New Roman" w:cs="Times New Roman"/>
+          <w:sz w:val="24"/>
+          <w:szCs w:val="24"/>
+        </w:rPr>
+        <w:t>visualizem</w:t>
+      </w:r>
+      <w:proofErr w:type="gramEnd"/>
+      <w:r>
+        <w:rPr>
+          <w:rFonts w:ascii="Times New Roman" w:hAnsi="Times New Roman" w:cs="Times New Roman"/>
+          <w:sz w:val="24"/>
+          <w:szCs w:val="24"/>
+        </w:rPr>
+        <w:t xml:space="preserve"> informações detalhadas do cuidador, incluindo experiência, avaliações e dados de contato.</w:t>
+      </w:r>
+    </w:p>
+    <w:p>
+      <w:pPr>
+        <w:rPr>
+          <w:rFonts w:ascii="Times New Roman" w:hAnsi="Times New Roman" w:cs="Times New Roman"/>
+          <w:sz w:val="24"/>
+          <w:szCs w:val="24"/>
+        </w:rPr>
+      </w:pPr>
+    </w:p>
+    <w:p>
+      <w:pPr>
+        <w:rPr>
+          <w:rFonts w:ascii="Times New Roman" w:hAnsi="Times New Roman" w:cs="Times New Roman"/>
+          <w:sz w:val="24"/>
+          <w:szCs w:val="24"/>
+        </w:rPr>
+      </w:pPr>
+      <w:r>
+        <w:rPr>
+          <w:rFonts w:ascii="Times New Roman" w:hAnsi="Times New Roman" w:cs="Times New Roman"/>
+          <w:sz w:val="24"/>
+          <w:szCs w:val="24"/>
+        </w:rPr>
+        <w:t xml:space="preserve">Prioridade: (X) essencial </w:t>
+      </w:r>
+      <w:proofErr w:type="gramStart"/>
+      <w:r>
+        <w:rPr>
+          <w:rFonts w:ascii="Times New Roman" w:hAnsi="Times New Roman" w:cs="Times New Roman"/>
+          <w:sz w:val="24"/>
+          <w:szCs w:val="24"/>
+        </w:rPr>
+        <w:t xml:space="preserve">( </w:t>
+      </w:r>
+      <w:proofErr w:type="gramEnd"/>
+      <w:r>
+        <w:rPr>
+          <w:rFonts w:ascii="Times New Roman" w:hAnsi="Times New Roman" w:cs="Times New Roman"/>
+          <w:sz w:val="24"/>
+          <w:szCs w:val="24"/>
+        </w:rPr>
+        <w:t>) importante ( ) desejável</w:t>
+      </w:r>
+    </w:p>
+    <w:p>
+      <w:pPr>
+        <w:rPr>
+          <w:rFonts w:ascii="Times New Roman" w:hAnsi="Times New Roman" w:cs="Times New Roman"/>
+          <w:sz w:val="24"/>
+          <w:szCs w:val="24"/>
+        </w:rPr>
+      </w:pPr>
+    </w:p>
+    <w:p>
+      <w:pPr>
+        <w:rPr>
+          <w:rFonts w:ascii="Times New Roman" w:hAnsi="Times New Roman" w:cs="Times New Roman"/>
+          <w:sz w:val="24"/>
+          <w:szCs w:val="24"/>
+        </w:rPr>
+      </w:pPr>
+      <w:r>
+        <w:rPr>
+          <w:rFonts w:ascii="Times New Roman" w:hAnsi="Times New Roman" w:cs="Times New Roman"/>
+          <w:sz w:val="24"/>
+          <w:szCs w:val="24"/>
+        </w:rPr>
+        <w:t>RF 6 – Avaliar cuidador</w:t>
+      </w:r>
+    </w:p>
+    <w:p>
+      <w:pPr>
+        <w:rPr>
+          <w:rFonts w:ascii="Times New Roman" w:hAnsi="Times New Roman" w:cs="Times New Roman"/>
+          <w:sz w:val="24"/>
+          <w:szCs w:val="24"/>
+        </w:rPr>
+      </w:pPr>
+      <w:r>
+        <w:rPr>
+          <w:rFonts w:ascii="Times New Roman" w:hAnsi="Times New Roman" w:cs="Times New Roman"/>
+          <w:sz w:val="24"/>
+          <w:szCs w:val="24"/>
         </w:rPr>
         <w:t>Descrição:</w:t>
       </w:r>
       <w:r>
         <w:rPr>
-          <w:rStyle w:val="bzpyqfadein"/>
+          <w:rFonts w:ascii="Times New Roman" w:hAnsi="Times New Roman" w:cs="Times New Roman"/>
+          <w:sz w:val="24"/>
+          <w:szCs w:val="24"/>
         </w:rPr>
         <w:t xml:space="preserve"> </w:t>
       </w:r>
       <w:r>
         <w:rPr>
-          <w:rStyle w:val="bzpyqfadein"/>
-        </w:rPr>
-        <w:t xml:space="preserve">O sistema deve permitir que cuidadores </w:t>
+          <w:rFonts w:ascii="Times New Roman" w:hAnsi="Times New Roman" w:cs="Times New Roman"/>
+          <w:sz w:val="24"/>
+          <w:szCs w:val="24"/>
+        </w:rPr>
+        <w:t xml:space="preserve">O sistema deve permitir que familiares </w:t>
       </w:r>
       <w:proofErr w:type="gramStart"/>
       <w:r>
         <w:rPr>
-          <w:rStyle w:val="bzpyqfadein"/>
-        </w:rPr>
-        <w:t>criem</w:t>
+          <w:rFonts w:ascii="Times New Roman" w:hAnsi="Times New Roman" w:cs="Times New Roman"/>
+          <w:sz w:val="24"/>
+          <w:szCs w:val="24"/>
+        </w:rPr>
+        <w:t>avaliem</w:t>
       </w:r>
       <w:proofErr w:type="gramEnd"/>
       <w:r>
         <w:rPr>
-          <w:rStyle w:val="bzpyqfadein"/>
-        </w:rPr>
-        <w:t xml:space="preserve"> um perfil profissional contendo informações como experiência, especializações, disponibil</w:t>
-      </w:r>
-      <w:r>
-        <w:rPr>
-          <w:rStyle w:val="bzpyqfadein"/>
-        </w:rPr>
-        <w:t>idade de horário e localização.</w:t>
-      </w:r>
-    </w:p>
-    <w:p>
-      <w:pPr>
-        <w:rPr>
-          <w:rFonts w:ascii="Times New Roman" w:hAnsi="Times New Roman" w:cs="Times New Roman"/>
-          <w:sz w:val="24"/>
-          <w:szCs w:val="24"/>
-        </w:rPr>
-      </w:pPr>
-      <w:r>
-        <w:rPr>
-          <w:rFonts w:ascii="Times New Roman" w:hAnsi="Times New Roman" w:cs="Times New Roman"/>
-          <w:sz w:val="24"/>
-          <w:szCs w:val="24"/>
-        </w:rPr>
-        <w:t xml:space="preserve">Prioridade: (X) essencial </w:t>
+          <w:rFonts w:ascii="Times New Roman" w:hAnsi="Times New Roman" w:cs="Times New Roman"/>
+          <w:sz w:val="24"/>
+          <w:szCs w:val="24"/>
+        </w:rPr>
+        <w:t xml:space="preserve"> cuidadores após a prestação do serviço, atribuindo notas e comentários.</w:t>
+      </w:r>
+    </w:p>
+    <w:p>
+      <w:pPr>
+        <w:rPr>
+          <w:rFonts w:ascii="Times New Roman" w:hAnsi="Times New Roman" w:cs="Times New Roman"/>
+          <w:sz w:val="24"/>
+          <w:szCs w:val="24"/>
+        </w:rPr>
+      </w:pPr>
+    </w:p>
+    <w:p>
+      <w:pPr>
+        <w:rPr>
+          <w:rFonts w:ascii="Times New Roman" w:hAnsi="Times New Roman" w:cs="Times New Roman"/>
+          <w:sz w:val="24"/>
+          <w:szCs w:val="24"/>
+        </w:rPr>
+      </w:pPr>
+      <w:r>
+        <w:rPr>
+          <w:rFonts w:ascii="Times New Roman" w:hAnsi="Times New Roman" w:cs="Times New Roman"/>
+          <w:sz w:val="24"/>
+          <w:szCs w:val="24"/>
+        </w:rPr>
+        <w:t xml:space="preserve">Prioridade: </w:t>
       </w:r>
       <w:proofErr w:type="gramStart"/>
       <w:r>
@@ -763,107 +1154,163 @@
           <w:sz w:val="24"/>
           <w:szCs w:val="24"/>
         </w:rPr>
-        <w:t>) importante ( ) desejável</w:t>
-      </w:r>
-    </w:p>
-    <w:p>
-      <w:pPr>
-        <w:rPr>
-          <w:rFonts w:ascii="Times New Roman" w:hAnsi="Times New Roman" w:cs="Times New Roman"/>
-          <w:sz w:val="24"/>
-          <w:szCs w:val="24"/>
-        </w:rPr>
-      </w:pPr>
-    </w:p>
-    <w:p>
-      <w:pPr>
-        <w:rPr>
-          <w:rFonts w:ascii="Times New Roman" w:hAnsi="Times New Roman" w:cs="Times New Roman"/>
-          <w:sz w:val="24"/>
-          <w:szCs w:val="24"/>
-        </w:rPr>
-      </w:pPr>
-      <w:r>
-        <w:rPr>
-          <w:rFonts w:ascii="Times New Roman" w:hAnsi="Times New Roman" w:cs="Times New Roman"/>
-          <w:sz w:val="24"/>
-          <w:szCs w:val="24"/>
-        </w:rPr>
-        <w:t xml:space="preserve">RF 4 – </w:t>
-      </w:r>
-      <w:r>
-        <w:rPr>
-          <w:rStyle w:val="bzpyqfadein"/>
-          <w:rFonts w:ascii="Times New Roman" w:hAnsi="Times New Roman" w:cs="Times New Roman"/>
-          <w:sz w:val="24"/>
-          <w:szCs w:val="24"/>
-        </w:rPr>
-        <w:t>Buscar cuidadores</w:t>
-      </w:r>
-    </w:p>
-    <w:p>
-      <w:pPr>
-        <w:rPr>
-          <w:rStyle w:val="bzpyqfadein"/>
-        </w:rPr>
-      </w:pPr>
-      <w:r>
-        <w:rPr>
-          <w:rStyle w:val="bzpyqfadein"/>
-        </w:rPr>
-        <w:t xml:space="preserve">Descrição: O sistema deve permitir que familiares </w:t>
+        <w:t>) essencial (X) importante ( ) desejável</w:t>
+      </w:r>
+    </w:p>
+    <w:p>
+      <w:pPr>
+        <w:rPr>
+          <w:rFonts w:ascii="Times New Roman" w:hAnsi="Times New Roman" w:cs="Times New Roman"/>
+          <w:sz w:val="24"/>
+          <w:szCs w:val="24"/>
+        </w:rPr>
+      </w:pPr>
+    </w:p>
+    <w:p>
+      <w:pPr>
+        <w:rPr>
+          <w:rFonts w:ascii="Times New Roman" w:hAnsi="Times New Roman" w:cs="Times New Roman"/>
+          <w:sz w:val="24"/>
+          <w:szCs w:val="24"/>
+        </w:rPr>
+      </w:pPr>
+      <w:r>
+        <w:rPr>
+          <w:rFonts w:ascii="Times New Roman" w:hAnsi="Times New Roman" w:cs="Times New Roman"/>
+          <w:sz w:val="24"/>
+          <w:szCs w:val="24"/>
+        </w:rPr>
+        <w:t>RF 7 – Enviar mensagens</w:t>
+      </w:r>
+    </w:p>
+    <w:p>
+      <w:pPr>
+        <w:rPr>
+          <w:rFonts w:ascii="Times New Roman" w:hAnsi="Times New Roman" w:cs="Times New Roman"/>
+          <w:sz w:val="24"/>
+          <w:szCs w:val="24"/>
+        </w:rPr>
+      </w:pPr>
+      <w:r>
+        <w:rPr>
+          <w:rFonts w:ascii="Times New Roman" w:hAnsi="Times New Roman" w:cs="Times New Roman"/>
+          <w:sz w:val="24"/>
+          <w:szCs w:val="24"/>
+        </w:rPr>
+        <w:t>Descrição: O sistema deve permitir a comunicação entre familiares e cuidadores através de mensagens dentro da plataforma.</w:t>
+      </w:r>
+    </w:p>
+    <w:p>
+      <w:pPr>
+        <w:rPr>
+          <w:rFonts w:ascii="Times New Roman" w:hAnsi="Times New Roman" w:cs="Times New Roman"/>
+          <w:sz w:val="24"/>
+          <w:szCs w:val="24"/>
+        </w:rPr>
+      </w:pPr>
+    </w:p>
+    <w:p>
+      <w:pPr>
+        <w:rPr>
+          <w:rFonts w:ascii="Times New Roman" w:hAnsi="Times New Roman" w:cs="Times New Roman"/>
+          <w:sz w:val="24"/>
+          <w:szCs w:val="24"/>
+        </w:rPr>
+      </w:pPr>
+      <w:r>
+        <w:rPr>
+          <w:rFonts w:ascii="Times New Roman" w:hAnsi="Times New Roman" w:cs="Times New Roman"/>
+          <w:sz w:val="24"/>
+          <w:szCs w:val="24"/>
+        </w:rPr>
+        <w:t xml:space="preserve">Prioridade: </w:t>
       </w:r>
       <w:proofErr w:type="gramStart"/>
       <w:r>
         <w:rPr>
-          <w:rStyle w:val="bzpyqfadein"/>
-        </w:rPr>
-        <w:t>pesquisem</w:t>
+          <w:rFonts w:ascii="Times New Roman" w:hAnsi="Times New Roman" w:cs="Times New Roman"/>
+          <w:sz w:val="24"/>
+          <w:szCs w:val="24"/>
+        </w:rPr>
+        <w:t xml:space="preserve">( </w:t>
       </w:r>
       <w:proofErr w:type="gramEnd"/>
       <w:r>
         <w:rPr>
-          <w:rStyle w:val="bzpyqfadein"/>
-        </w:rPr>
-        <w:t xml:space="preserve"> cuidadores disponíveis uti</w:t>
-      </w:r>
-      <w:r>
-        <w:rPr>
-          <w:rStyle w:val="bzpyqfadein"/>
-        </w:rPr>
-        <w:t>lizando filtros</w:t>
-      </w:r>
-      <w:r>
-        <w:rPr>
-          <w:rStyle w:val="bzpyqfadein"/>
-        </w:rPr>
-        <w:t>, experiência e disponibilidade.</w:t>
-      </w:r>
-    </w:p>
-    <w:p>
-      <w:pPr>
-        <w:rPr>
-          <w:rFonts w:ascii="Times New Roman" w:hAnsi="Times New Roman" w:cs="Times New Roman"/>
-          <w:sz w:val="24"/>
-          <w:szCs w:val="24"/>
-        </w:rPr>
-      </w:pPr>
-    </w:p>
-    <w:p>
-      <w:pPr>
-        <w:rPr>
-          <w:rFonts w:ascii="Times New Roman" w:hAnsi="Times New Roman" w:cs="Times New Roman"/>
-          <w:sz w:val="24"/>
-          <w:szCs w:val="24"/>
-        </w:rPr>
-      </w:pPr>
-      <w:r>
-        <w:rPr>
-          <w:rFonts w:ascii="Times New Roman" w:hAnsi="Times New Roman" w:cs="Times New Roman"/>
-          <w:sz w:val="24"/>
-          <w:szCs w:val="24"/>
-        </w:rPr>
-        <w:t xml:space="preserve">Prioridade: (X) essencial </w:t>
+          <w:rFonts w:ascii="Times New Roman" w:hAnsi="Times New Roman" w:cs="Times New Roman"/>
+          <w:sz w:val="24"/>
+          <w:szCs w:val="24"/>
+        </w:rPr>
+        <w:t>) essencial (X) importante ( ) desejável</w:t>
+      </w:r>
+    </w:p>
+    <w:p>
+      <w:pPr>
+        <w:rPr>
+          <w:rFonts w:ascii="Times New Roman" w:hAnsi="Times New Roman" w:cs="Times New Roman"/>
+          <w:sz w:val="24"/>
+          <w:szCs w:val="24"/>
+        </w:rPr>
+      </w:pPr>
+    </w:p>
+    <w:p>
+      <w:pPr>
+        <w:rPr>
+          <w:rFonts w:ascii="Times New Roman" w:hAnsi="Times New Roman" w:cs="Times New Roman"/>
+          <w:sz w:val="24"/>
+          <w:szCs w:val="24"/>
+        </w:rPr>
+      </w:pPr>
+      <w:r>
+        <w:rPr>
+          <w:rFonts w:ascii="Times New Roman" w:hAnsi="Times New Roman" w:cs="Times New Roman"/>
+          <w:sz w:val="24"/>
+          <w:szCs w:val="24"/>
+        </w:rPr>
+        <w:t>RF 8 – Gerenciar perfil</w:t>
+      </w:r>
+    </w:p>
+    <w:p>
+      <w:pPr>
+        <w:rPr>
+          <w:rFonts w:ascii="Times New Roman" w:hAnsi="Times New Roman" w:cs="Times New Roman"/>
+          <w:sz w:val="24"/>
+          <w:szCs w:val="24"/>
+        </w:rPr>
+      </w:pPr>
+      <w:r>
+        <w:rPr>
+          <w:rFonts w:ascii="Times New Roman" w:hAnsi="Times New Roman" w:cs="Times New Roman"/>
+          <w:sz w:val="24"/>
+          <w:szCs w:val="24"/>
+        </w:rPr>
+        <w:t>Descrição: O sistema deve permitir que usuários atualizem suas informações pessoais, foto de perfil, senha e dados de contato.</w:t>
+      </w:r>
+    </w:p>
+    <w:p>
+      <w:pPr>
+        <w:rPr>
+          <w:rFonts w:ascii="Times New Roman" w:hAnsi="Times New Roman" w:cs="Times New Roman"/>
+          <w:sz w:val="24"/>
+          <w:szCs w:val="24"/>
+        </w:rPr>
+      </w:pPr>
+    </w:p>
+    <w:p>
+      <w:pPr>
+        <w:rPr>
+          <w:rFonts w:ascii="Times New Roman" w:hAnsi="Times New Roman" w:cs="Times New Roman"/>
+          <w:sz w:val="24"/>
+          <w:szCs w:val="24"/>
+        </w:rPr>
+      </w:pPr>
+      <w:r>
+        <w:rPr>
+          <w:rFonts w:ascii="Times New Roman" w:hAnsi="Times New Roman" w:cs="Times New Roman"/>
+          <w:sz w:val="24"/>
+          <w:szCs w:val="24"/>
+        </w:rPr>
+        <w:t xml:space="preserve">Prioridade: </w:t>
       </w:r>
       <w:proofErr w:type="gramStart"/>
       <w:r>
@@ -881,446 +1328,10 @@
           <w:sz w:val="24"/>
           <w:szCs w:val="24"/>
         </w:rPr>
-        <w:t>) importante ( ) desejável</w:t>
-      </w:r>
-    </w:p>
-    <w:p>
-      <w:pPr>
-        <w:rPr>
-          <w:rFonts w:ascii="Times New Roman" w:hAnsi="Times New Roman" w:cs="Times New Roman"/>
-          <w:sz w:val="24"/>
-          <w:szCs w:val="24"/>
-        </w:rPr>
-      </w:pPr>
-    </w:p>
-    <w:p>
-      <w:pPr>
-        <w:rPr>
-          <w:rFonts w:ascii="Times New Roman" w:hAnsi="Times New Roman" w:cs="Times New Roman"/>
-          <w:sz w:val="24"/>
-          <w:szCs w:val="24"/>
-        </w:rPr>
-      </w:pPr>
-    </w:p>
-    <w:p>
-      <w:pPr>
-        <w:rPr>
-          <w:rFonts w:ascii="Times New Roman" w:hAnsi="Times New Roman" w:cs="Times New Roman"/>
-          <w:sz w:val="24"/>
-          <w:szCs w:val="24"/>
-        </w:rPr>
-      </w:pPr>
-    </w:p>
-    <w:p>
-      <w:pPr>
-        <w:rPr>
-          <w:rFonts w:ascii="Times New Roman" w:hAnsi="Times New Roman" w:cs="Times New Roman"/>
-          <w:sz w:val="24"/>
-          <w:szCs w:val="24"/>
-        </w:rPr>
-      </w:pPr>
-    </w:p>
-    <w:p>
-      <w:pPr>
-        <w:rPr>
-          <w:rFonts w:ascii="Times New Roman" w:hAnsi="Times New Roman" w:cs="Times New Roman"/>
-          <w:sz w:val="24"/>
-          <w:szCs w:val="24"/>
-        </w:rPr>
-      </w:pPr>
-      <w:r>
-        <w:rPr>
-          <w:rFonts w:ascii="Times New Roman" w:hAnsi="Times New Roman" w:cs="Times New Roman"/>
-          <w:sz w:val="24"/>
-          <w:szCs w:val="24"/>
-        </w:rPr>
-        <w:lastRenderedPageBreak/>
-        <w:t xml:space="preserve">RF 5 </w:t>
-      </w:r>
-      <w:r>
-        <w:rPr>
-          <w:rFonts w:ascii="Times New Roman" w:hAnsi="Times New Roman" w:cs="Times New Roman"/>
-          <w:sz w:val="24"/>
-          <w:szCs w:val="24"/>
-        </w:rPr>
-        <w:t>– Visualizar perfil do cuidador</w:t>
-      </w:r>
-    </w:p>
-    <w:p>
-      <w:pPr>
-        <w:rPr>
-          <w:rStyle w:val="bzpyqfadein"/>
-        </w:rPr>
-      </w:pPr>
-      <w:r>
-        <w:rPr>
-          <w:rStyle w:val="bzpyqfadein"/>
-        </w:rPr>
-        <w:t xml:space="preserve">Descrição: O sistema deve permitir que usuários </w:t>
-      </w:r>
-      <w:proofErr w:type="gramStart"/>
-      <w:r>
-        <w:rPr>
-          <w:rStyle w:val="bzpyqfadein"/>
-        </w:rPr>
-        <w:t>visualizem</w:t>
-      </w:r>
-      <w:proofErr w:type="gramEnd"/>
-      <w:r>
-        <w:rPr>
-          <w:rStyle w:val="bzpyqfadein"/>
-        </w:rPr>
-        <w:t xml:space="preserve"> informações detalhadas do cuidador, incluindo experiência, avaliações e dados de contato.</w:t>
-      </w:r>
-    </w:p>
-    <w:p>
-      <w:pPr>
-        <w:rPr>
-          <w:rFonts w:ascii="Times New Roman" w:hAnsi="Times New Roman" w:cs="Times New Roman"/>
-          <w:sz w:val="24"/>
-          <w:szCs w:val="24"/>
-        </w:rPr>
-      </w:pPr>
-    </w:p>
-    <w:p>
-      <w:pPr>
-        <w:rPr>
-          <w:rFonts w:ascii="Times New Roman" w:hAnsi="Times New Roman" w:cs="Times New Roman"/>
-          <w:sz w:val="24"/>
-          <w:szCs w:val="24"/>
-        </w:rPr>
-      </w:pPr>
-      <w:r>
-        <w:rPr>
-          <w:rFonts w:ascii="Times New Roman" w:hAnsi="Times New Roman" w:cs="Times New Roman"/>
-          <w:sz w:val="24"/>
-          <w:szCs w:val="24"/>
-        </w:rPr>
-        <w:t xml:space="preserve">Prioridade: (X) essencial </w:t>
-      </w:r>
-      <w:proofErr w:type="gramStart"/>
-      <w:r>
-        <w:rPr>
-          <w:rFonts w:ascii="Times New Roman" w:hAnsi="Times New Roman" w:cs="Times New Roman"/>
-          <w:sz w:val="24"/>
-          <w:szCs w:val="24"/>
-        </w:rPr>
-        <w:t xml:space="preserve">( </w:t>
-      </w:r>
-      <w:proofErr w:type="gramEnd"/>
-      <w:r>
-        <w:rPr>
-          <w:rFonts w:ascii="Times New Roman" w:hAnsi="Times New Roman" w:cs="Times New Roman"/>
-          <w:sz w:val="24"/>
-          <w:szCs w:val="24"/>
-        </w:rPr>
-        <w:t>) importante ( ) desejável</w:t>
-      </w:r>
-    </w:p>
-    <w:p>
-      <w:pPr>
-        <w:rPr>
-          <w:rFonts w:ascii="Times New Roman" w:hAnsi="Times New Roman" w:cs="Times New Roman"/>
-          <w:sz w:val="24"/>
-          <w:szCs w:val="24"/>
-        </w:rPr>
-      </w:pPr>
-    </w:p>
-    <w:p>
-      <w:pPr>
-        <w:rPr>
-          <w:rFonts w:ascii="Times New Roman" w:hAnsi="Times New Roman" w:cs="Times New Roman"/>
-          <w:sz w:val="24"/>
-          <w:szCs w:val="24"/>
-        </w:rPr>
-      </w:pPr>
-      <w:r>
-        <w:rPr>
-          <w:rFonts w:ascii="Times New Roman" w:hAnsi="Times New Roman" w:cs="Times New Roman"/>
-          <w:sz w:val="24"/>
-          <w:szCs w:val="24"/>
-        </w:rPr>
-        <w:t>RF 6 – Avaliar cuidador</w:t>
-      </w:r>
-    </w:p>
-    <w:p>
-      <w:pPr>
-        <w:rPr>
-          <w:rStyle w:val="bzpyqfadein"/>
-        </w:rPr>
-      </w:pPr>
-      <w:r>
-        <w:rPr>
-          <w:rFonts w:ascii="Times New Roman" w:hAnsi="Times New Roman" w:cs="Times New Roman"/>
-          <w:sz w:val="24"/>
-          <w:szCs w:val="24"/>
-        </w:rPr>
-        <w:t>Descrição:</w:t>
-      </w:r>
-      <w:r>
-        <w:rPr>
-          <w:rFonts w:ascii="Times New Roman" w:hAnsi="Times New Roman" w:cs="Times New Roman"/>
-          <w:sz w:val="24"/>
-          <w:szCs w:val="24"/>
-        </w:rPr>
-        <w:t xml:space="preserve"> </w:t>
-      </w:r>
-      <w:r>
-        <w:rPr>
-          <w:rStyle w:val="bzpyqfadein"/>
-        </w:rPr>
-        <w:t xml:space="preserve">O sistema deve permitir que familiares </w:t>
-      </w:r>
-      <w:proofErr w:type="gramStart"/>
-      <w:r>
-        <w:rPr>
-          <w:rStyle w:val="bzpyqfadein"/>
-        </w:rPr>
-        <w:t>avaliem</w:t>
-      </w:r>
-      <w:proofErr w:type="gramEnd"/>
-      <w:r>
-        <w:rPr>
-          <w:rStyle w:val="bzpyqfadein"/>
-        </w:rPr>
-        <w:t xml:space="preserve"> cuidadores após a prestação do serviço, atribuindo notas e comentários.</w:t>
-      </w:r>
-    </w:p>
-    <w:p>
-      <w:pPr>
-        <w:rPr>
-          <w:rFonts w:ascii="Times New Roman" w:hAnsi="Times New Roman" w:cs="Times New Roman"/>
-          <w:sz w:val="24"/>
-          <w:szCs w:val="24"/>
-        </w:rPr>
-      </w:pPr>
-    </w:p>
-    <w:p>
-      <w:pPr>
-        <w:rPr>
-          <w:rFonts w:ascii="Times New Roman" w:hAnsi="Times New Roman" w:cs="Times New Roman"/>
-          <w:sz w:val="24"/>
-          <w:szCs w:val="24"/>
-        </w:rPr>
-      </w:pPr>
-      <w:r>
-        <w:rPr>
-          <w:rFonts w:ascii="Times New Roman" w:hAnsi="Times New Roman" w:cs="Times New Roman"/>
-          <w:sz w:val="24"/>
-          <w:szCs w:val="24"/>
-        </w:rPr>
-        <w:t xml:space="preserve">Prioridade: </w:t>
-      </w:r>
-      <w:proofErr w:type="gramStart"/>
-      <w:r>
-        <w:rPr>
-          <w:rFonts w:ascii="Times New Roman" w:hAnsi="Times New Roman" w:cs="Times New Roman"/>
-          <w:sz w:val="24"/>
-          <w:szCs w:val="24"/>
-        </w:rPr>
-        <w:t xml:space="preserve">( </w:t>
-      </w:r>
-      <w:proofErr w:type="gramEnd"/>
-      <w:r>
-        <w:rPr>
-          <w:rFonts w:ascii="Times New Roman" w:hAnsi="Times New Roman" w:cs="Times New Roman"/>
-          <w:sz w:val="24"/>
-          <w:szCs w:val="24"/>
-        </w:rPr>
         <w:t>) essencial (X) importante ( ) desejável</w:t>
-      </w:r>
-    </w:p>
-    <w:p>
-      <w:pPr>
-        <w:rPr>
-          <w:rFonts w:ascii="Times New Roman" w:hAnsi="Times New Roman" w:cs="Times New Roman"/>
-          <w:sz w:val="24"/>
-          <w:szCs w:val="24"/>
-        </w:rPr>
-      </w:pPr>
-    </w:p>
-    <w:p>
-      <w:pPr>
-        <w:rPr>
-          <w:rFonts w:ascii="Times New Roman" w:hAnsi="Times New Roman" w:cs="Times New Roman"/>
-          <w:sz w:val="24"/>
-          <w:szCs w:val="24"/>
-        </w:rPr>
-      </w:pPr>
-      <w:r>
-        <w:rPr>
-          <w:rFonts w:ascii="Times New Roman" w:hAnsi="Times New Roman" w:cs="Times New Roman"/>
-          <w:sz w:val="24"/>
-          <w:szCs w:val="24"/>
-        </w:rPr>
-        <w:t>RF 7 – Enviar mensagens</w:t>
-      </w:r>
-    </w:p>
-    <w:p>
-      <w:pPr>
-        <w:rPr>
-          <w:rStyle w:val="bzpyqfadein"/>
-        </w:rPr>
-      </w:pPr>
-      <w:r>
-        <w:rPr>
-          <w:rStyle w:val="bzpyqfadein"/>
-        </w:rPr>
-        <w:t xml:space="preserve">Descrição: </w:t>
-      </w:r>
-      <w:r>
-        <w:rPr>
-          <w:rStyle w:val="bzpyqfadein"/>
-        </w:rPr>
-        <w:t>O sistema deve permitir a comunicação entre familiares e cuidadores através de mensagens dentro da plataforma.</w:t>
-      </w:r>
-    </w:p>
-    <w:p>
-      <w:pPr>
-        <w:rPr>
-          <w:rFonts w:ascii="Times New Roman" w:hAnsi="Times New Roman" w:cs="Times New Roman"/>
-          <w:sz w:val="24"/>
-          <w:szCs w:val="24"/>
-        </w:rPr>
-      </w:pPr>
-    </w:p>
-    <w:p>
-      <w:pPr>
-        <w:rPr>
-          <w:rFonts w:ascii="Times New Roman" w:hAnsi="Times New Roman" w:cs="Times New Roman"/>
-          <w:sz w:val="24"/>
-          <w:szCs w:val="24"/>
-        </w:rPr>
-      </w:pPr>
-      <w:r>
-        <w:rPr>
-          <w:rFonts w:ascii="Times New Roman" w:hAnsi="Times New Roman" w:cs="Times New Roman"/>
-          <w:sz w:val="24"/>
-          <w:szCs w:val="24"/>
-        </w:rPr>
-        <w:t xml:space="preserve">Prioridade: </w:t>
-      </w:r>
-      <w:proofErr w:type="gramStart"/>
-      <w:r>
-        <w:rPr>
-          <w:rFonts w:ascii="Times New Roman" w:hAnsi="Times New Roman" w:cs="Times New Roman"/>
-          <w:sz w:val="24"/>
-          <w:szCs w:val="24"/>
-        </w:rPr>
-        <w:t xml:space="preserve">( </w:t>
-      </w:r>
-      <w:proofErr w:type="gramEnd"/>
-      <w:r>
-        <w:rPr>
-          <w:rFonts w:ascii="Times New Roman" w:hAnsi="Times New Roman" w:cs="Times New Roman"/>
-          <w:sz w:val="24"/>
-          <w:szCs w:val="24"/>
-        </w:rPr>
-        <w:t>) essencial (X) importante ( ) desejável</w:t>
-      </w:r>
-    </w:p>
-    <w:p>
-      <w:pPr>
-        <w:rPr>
-          <w:rFonts w:ascii="Times New Roman" w:hAnsi="Times New Roman" w:cs="Times New Roman"/>
-          <w:sz w:val="24"/>
-          <w:szCs w:val="24"/>
-        </w:rPr>
-      </w:pPr>
-    </w:p>
-    <w:p>
-      <w:pPr>
-        <w:rPr>
-          <w:rFonts w:ascii="Times New Roman" w:hAnsi="Times New Roman" w:cs="Times New Roman"/>
-          <w:sz w:val="24"/>
-          <w:szCs w:val="24"/>
-        </w:rPr>
-      </w:pPr>
-      <w:r>
-        <w:rPr>
-          <w:rFonts w:ascii="Times New Roman" w:hAnsi="Times New Roman" w:cs="Times New Roman"/>
-          <w:sz w:val="24"/>
-          <w:szCs w:val="24"/>
-        </w:rPr>
-        <w:t>RF 8 – Gerenciar perfil</w:t>
-      </w:r>
-    </w:p>
-    <w:p>
-      <w:pPr>
-        <w:rPr>
-          <w:rStyle w:val="bzpyqfadein"/>
-        </w:rPr>
-      </w:pPr>
-      <w:r>
-        <w:rPr>
-          <w:rStyle w:val="bzpyqfadein"/>
-        </w:rPr>
-        <w:t>Descrição:</w:t>
-      </w:r>
-      <w:r>
-        <w:rPr>
-          <w:rStyle w:val="bzpyqfadein"/>
-        </w:rPr>
-        <w:t xml:space="preserve"> </w:t>
-      </w:r>
-      <w:r>
-        <w:rPr>
-          <w:rStyle w:val="bzpyqfadein"/>
-        </w:rPr>
-        <w:t>O sistema deve permitir que usuários a</w:t>
       </w:r>
       <w:bookmarkStart w:id="0" w:name="_GoBack"/>
       <w:bookmarkEnd w:id="0"/>
-      <w:r>
-        <w:rPr>
-          <w:rStyle w:val="bzpyqfadein"/>
-        </w:rPr>
-        <w:t>tualizem suas informações pessoais, foto de perfil, senha e dados de contato.</w:t>
-      </w:r>
-    </w:p>
-    <w:p>
-      <w:pPr>
-        <w:rPr>
-          <w:rFonts w:ascii="Times New Roman" w:hAnsi="Times New Roman" w:cs="Times New Roman"/>
-          <w:sz w:val="24"/>
-          <w:szCs w:val="24"/>
-        </w:rPr>
-      </w:pPr>
-    </w:p>
-    <w:p>
-      <w:pPr>
-        <w:rPr>
-          <w:rFonts w:ascii="Arial" w:hAnsi="Arial" w:cs="Arial"/>
-          <w:sz w:val="20"/>
-          <w:szCs w:val="20"/>
-        </w:rPr>
-      </w:pPr>
-      <w:r>
-        <w:rPr>
-          <w:rFonts w:ascii="Times New Roman" w:hAnsi="Times New Roman" w:cs="Times New Roman"/>
-          <w:sz w:val="24"/>
-          <w:szCs w:val="24"/>
-        </w:rPr>
-        <w:t xml:space="preserve">Prioridade: </w:t>
-      </w:r>
-      <w:proofErr w:type="gramStart"/>
-      <w:r>
-        <w:rPr>
-          <w:rFonts w:ascii="Times New Roman" w:hAnsi="Times New Roman" w:cs="Times New Roman"/>
-          <w:sz w:val="24"/>
-          <w:szCs w:val="24"/>
-        </w:rPr>
-        <w:t xml:space="preserve">( </w:t>
-      </w:r>
-      <w:proofErr w:type="gramEnd"/>
-      <w:r>
-        <w:rPr>
-          <w:rFonts w:ascii="Times New Roman" w:hAnsi="Times New Roman" w:cs="Times New Roman"/>
-          <w:sz w:val="24"/>
-          <w:szCs w:val="24"/>
-        </w:rPr>
-        <w:t>) essencial (X) importante ( ) desejável</w:t>
-      </w:r>
     </w:p>
     <w:sectPr>
       <w:headerReference w:type="even" r:id="rId7"/>
@@ -2393,7 +2404,7 @@
   <a:extraClrSchemeLst/>
   <a:extLst>
     <a:ext uri="{05A4C25C-085E-4340-85A3-A5531E510DB2}">
-      <thm15:themeFamily xmlns:thm15="http://schemas.microsoft.com/office/thememl/2012/main" xmlns="" name="Office Theme" id="{62F939B6-93AF-4DB8-9C6B-D6C7DFDC589F}" vid="{4A3C46E8-61CC-4603-A589-7422A47A8E4A}"/>
+      <thm15:themeFamily xmlns="" xmlns:thm15="http://schemas.microsoft.com/office/thememl/2012/main" name="Office Theme" id="{62F939B6-93AF-4DB8-9C6B-D6C7DFDC589F}" vid="{4A3C46E8-61CC-4603-A589-7422A47A8E4A}"/>
     </a:ext>
   </a:extLst>
 </a:theme>

</xml_diff>